<commit_message>
Version 1.2: fit the standard course, gentler drives, add package builds
- Course limits fit the standard 1.6 m x 2.3 m course (N 222, E 24, W 135)
- Drives speed up and slow down gently; reverse slowly up to walls
- MAX_TRUSTED_CM 200 (the sensor's limit)
- Tip to fit the colour sensor in front (packages with the grid)
- File header: teams may read and change the software
- Rebuild the three package files and regenerate the manuals
- Ignore __pycache__

Co-Authored-By: Claude Opus 5.5 <noreply@anthropic.com>
</commit_message>
<xml_diff>
--- a/docs/Rover Simulator - User Manual.docx
+++ b/docs/Rover Simulator - User Manual.docx
@@ -38,7 +38,7 @@
         <w:rPr>
           <w:color w:val="5B6867"/>
         </w:rPr>
-        <w:t xml:space="preserve">For rover software version 1.1, 17 October 2026.</w:t>
+        <w:t xml:space="preserve">For rover software version 1.2, 17 October 2026.</w:t>
       </w:r>
     </w:p>
     <w:p>
@@ -2339,7 +2339,7 @@
               <w:spacing w:after="40" w:before="40"/>
             </w:pPr>
             <w:r>
-              <w:t xml:space="preserve">Green and red boxes</w:t>
+              <w:t xml:space="preserve">Green, red and blue boxes</w:t>
             </w:r>
           </w:p>
         </w:tc>
@@ -2359,6 +2359,61 @@
             </w:pPr>
             <w:r>
               <w:t xml:space="preserve">The colour patches.</w:t>
+            </w:r>
+          </w:p>
+        </w:tc>
+      </w:tr>
+      <w:tr>
+        <w:trPr>
+          <w:cantSplit/>
+        </w:trPr>
+        <w:tc>
+          <w:tcPr>
+            <w:tcW w:type="dxa" w:w="3084"/>
+            <w:tcMar>
+              <w:top w:type="dxa" w:w="60"/>
+              <w:left w:type="dxa" w:w="100"/>
+              <w:bottom w:type="dxa" w:w="60"/>
+              <w:right w:type="dxa" w:w="100"/>
+            </w:tcMar>
+          </w:tcPr>
+          <w:p>
+            <w:pPr>
+              <w:spacing w:after="40" w:before="40"/>
+            </w:pPr>
+            <w:r>
+              <w:t xml:space="preserve">Yellow dashed box</w:t>
+            </w:r>
+          </w:p>
+        </w:tc>
+        <w:tc>
+          <w:tcPr>
+            <w:tcW w:type="dxa" w:w="6554"/>
+            <w:tcMar>
+              <w:top w:type="dxa" w:w="60"/>
+              <w:left w:type="dxa" w:w="100"/>
+              <w:bottom w:type="dxa" w:w="60"/>
+              <w:right w:type="dxa" w:w="100"/>
+            </w:tcMar>
+          </w:tcPr>
+          <w:p>
+            <w:pPr>
+              <w:spacing w:after="40" w:before="40"/>
+            </w:pPr>
+            <w:r>
+              <w:t xml:space="preserve">The </w:t>
+            </w:r>
+            <w:r>
+              <w:rPr>
+                <w:rFonts w:ascii="Consolas" w:cs="Consolas" w:eastAsia="Consolas" w:hAnsi="Consolas"/>
+                <w:color w:val="7A2E12"/>
+                <w:sz w:val="20"/>
+                <w:szCs w:val="20"/>
+              </w:rPr>
+              <w:t xml:space="preserve">COURSE_</w:t>
+            </w:r>
+            <w:r>
+              <w:t xml:space="preserve"> limits from your code (Wall follower and Maze explorer). The rover never plans a move outside it.</w:t>
             </w:r>
           </w:p>
         </w:tc>
@@ -5331,7 +5386,7 @@
         <w:t xml:space="preserve">Course</w:t>
       </w:r>
       <w:r>
-        <w:t xml:space="preserve"> tab has three ready-made courses (</w:t>
+        <w:t xml:space="preserve"> tab has four ready-made courses (</w:t>
       </w:r>
       <w:r>
         <w:rPr>
@@ -5341,7 +5396,7 @@
         <w:t xml:space="preserve">Load preset</w:t>
       </w:r>
       <w:r>
-        <w:t xml:space="preserve">) and </w:t>
+        <w:t xml:space="preserve">), including the real competition course, and </w:t>
       </w:r>
       <w:r>
         <w:rPr>
@@ -6446,7 +6501,7 @@
         <w:sz w:val="16"/>
         <w:szCs w:val="16"/>
       </w:rPr>
-      <w:t xml:space="preserve">Rover Simulator — User Manual  ·  version 1.1  ·  page </w:t>
+      <w:t xml:space="preserve">Rover Simulator — User Manual  ·  version 1.2  ·  page </w:t>
     </w:r>
     <w:r>
       <w:rPr>

</xml_diff>

<commit_message>
Student release 1.2: standard course limits, gentler drives
Rebuilt packages, simulator and manuals from modular-rover-software fe111ae.
The example my_program in spike_all_in_one.py is unchanged.

Co-Authored-By: Claude Opus 5.5 <noreply@anthropic.com>
</commit_message>
<xml_diff>
--- a/docs/Rover Simulator - User Manual.docx
+++ b/docs/Rover Simulator - User Manual.docx
@@ -38,7 +38,7 @@
         <w:rPr>
           <w:color w:val="5B6867"/>
         </w:rPr>
-        <w:t xml:space="preserve">For rover software version 1.1, 17 October 2026.</w:t>
+        <w:t xml:space="preserve">For rover software version 1.2, 17 October 2026.</w:t>
       </w:r>
     </w:p>
     <w:p>
@@ -2339,7 +2339,7 @@
               <w:spacing w:after="40" w:before="40"/>
             </w:pPr>
             <w:r>
-              <w:t xml:space="preserve">Green and red boxes</w:t>
+              <w:t xml:space="preserve">Green, red and blue boxes</w:t>
             </w:r>
           </w:p>
         </w:tc>
@@ -2359,6 +2359,61 @@
             </w:pPr>
             <w:r>
               <w:t xml:space="preserve">The colour patches.</w:t>
+            </w:r>
+          </w:p>
+        </w:tc>
+      </w:tr>
+      <w:tr>
+        <w:trPr>
+          <w:cantSplit/>
+        </w:trPr>
+        <w:tc>
+          <w:tcPr>
+            <w:tcW w:type="dxa" w:w="3084"/>
+            <w:tcMar>
+              <w:top w:type="dxa" w:w="60"/>
+              <w:left w:type="dxa" w:w="100"/>
+              <w:bottom w:type="dxa" w:w="60"/>
+              <w:right w:type="dxa" w:w="100"/>
+            </w:tcMar>
+          </w:tcPr>
+          <w:p>
+            <w:pPr>
+              <w:spacing w:after="40" w:before="40"/>
+            </w:pPr>
+            <w:r>
+              <w:t xml:space="preserve">Yellow dashed box</w:t>
+            </w:r>
+          </w:p>
+        </w:tc>
+        <w:tc>
+          <w:tcPr>
+            <w:tcW w:type="dxa" w:w="6554"/>
+            <w:tcMar>
+              <w:top w:type="dxa" w:w="60"/>
+              <w:left w:type="dxa" w:w="100"/>
+              <w:bottom w:type="dxa" w:w="60"/>
+              <w:right w:type="dxa" w:w="100"/>
+            </w:tcMar>
+          </w:tcPr>
+          <w:p>
+            <w:pPr>
+              <w:spacing w:after="40" w:before="40"/>
+            </w:pPr>
+            <w:r>
+              <w:t xml:space="preserve">The </w:t>
+            </w:r>
+            <w:r>
+              <w:rPr>
+                <w:rFonts w:ascii="Consolas" w:cs="Consolas" w:eastAsia="Consolas" w:hAnsi="Consolas"/>
+                <w:color w:val="7A2E12"/>
+                <w:sz w:val="20"/>
+                <w:szCs w:val="20"/>
+              </w:rPr>
+              <w:t xml:space="preserve">COURSE_</w:t>
+            </w:r>
+            <w:r>
+              <w:t xml:space="preserve"> limits from your code (Wall follower and Maze explorer). The rover never plans a move outside it.</w:t>
             </w:r>
           </w:p>
         </w:tc>
@@ -5331,7 +5386,7 @@
         <w:t xml:space="preserve">Course</w:t>
       </w:r>
       <w:r>
-        <w:t xml:space="preserve"> tab has three ready-made courses (</w:t>
+        <w:t xml:space="preserve"> tab has four ready-made courses (</w:t>
       </w:r>
       <w:r>
         <w:rPr>
@@ -5341,7 +5396,7 @@
         <w:t xml:space="preserve">Load preset</w:t>
       </w:r>
       <w:r>
-        <w:t xml:space="preserve">) and </w:t>
+        <w:t xml:space="preserve">), including the real competition course, and </w:t>
       </w:r>
       <w:r>
         <w:rPr>
@@ -6446,7 +6501,7 @@
         <w:sz w:val="16"/>
         <w:szCs w:val="16"/>
       </w:rPr>
-      <w:t xml:space="preserve">Rover Simulator — User Manual  ·  version 1.1  ·  page </w:t>
+      <w:t xml:space="preserve">Rover Simulator — User Manual  ·  version 1.2  ·  page </w:t>
     </w:r>
     <w:r>
       <w:rPr>

</xml_diff>